<commit_message>
Voce degli alunni facoltativa, nessun indizio su PEI e PDP, stampa senza menu
- Modulo B: le registrazioni audio con la voce dell'alunno sono un'eventualità facoltativa
- Moduli A e B: l'informativa è quella "allegata a questo modulo"
- Checklist del kit: la pagina non deve far capire chi ha un PEI o un PDP
- UDA (tre gradi): formati alternativi aperti a tutta la classe, punto Riservatezza; Word e PDF rigenerati
- Guida: le domande dei bambini si possono tagliare dall'audio delle interviste
- vpv.css: in stampa niente menu fisso né piè di pagina

Co-Authored-By: Claude Opus 5.5 <noreply@anthropic.com>
</commit_message>
<xml_diff>
--- a/UDA/UDA_ViaPerVia_Primaria.docx
+++ b/UDA/UDA_ViaPerVia_Primaria.docx
@@ -8,7 +8,6 @@
         <w:bidi w:val="0"/>
         <w:spacing w:before="240" w:after="120"/>
         <w:ind w:hanging="0" w:left="0" w:right="0"/>
-        <w:jc w:val="left"/>
         <w:rPr/>
       </w:pPr>
       <w:bookmarkStart w:id="0" w:name="uda-via-per-via"/>
@@ -23,7 +22,6 @@
         <w:pStyle w:val="Heading2"/>
         <w:bidi w:val="0"/>
         <w:ind w:hanging="0" w:left="0" w:right="0"/>
-        <w:jc w:val="left"/>
         <w:rPr/>
       </w:pPr>
       <w:bookmarkStart w:id="1" w:name="la-nostra-città-si-racconta"/>
@@ -38,7 +36,6 @@
         <w:pStyle w:val="Heading3"/>
         <w:bidi w:val="0"/>
         <w:ind w:hanging="0" w:left="0" w:right="0"/>
-        <w:jc w:val="left"/>
         <w:rPr/>
       </w:pPr>
       <w:bookmarkStart w:id="2" w:name="scuola-primaria-classi-4ª-5ª"/>
@@ -52,7 +49,6 @@
       <w:pPr>
         <w:pStyle w:val="BlockQuotation"/>
         <w:bidi w:val="0"/>
-        <w:jc w:val="left"/>
         <w:rPr/>
       </w:pPr>
       <w:r>
@@ -80,7 +76,6 @@
       <w:pPr>
         <w:pStyle w:val="BlockQuotation"/>
         <w:bidi w:val="0"/>
-        <w:jc w:val="left"/>
         <w:rPr/>
       </w:pPr>
       <w:r>
@@ -119,7 +114,6 @@
         <w:pStyle w:val="Heading2"/>
         <w:bidi w:val="0"/>
         <w:ind w:hanging="0" w:left="0" w:right="0"/>
-        <w:jc w:val="left"/>
         <w:rPr/>
       </w:pPr>
       <w:bookmarkStart w:id="3" w:name="sezione-1-dati-identificativi"/>
@@ -219,7 +213,6 @@
               <w:widowControl w:val="false"/>
               <w:suppressLineNumbers/>
               <w:bidi w:val="0"/>
-              <w:jc w:val="left"/>
               <w:rPr/>
             </w:pPr>
             <w:r>
@@ -246,7 +239,6 @@
               <w:widowControl w:val="false"/>
               <w:suppressLineNumbers/>
               <w:bidi w:val="0"/>
-              <w:jc w:val="left"/>
               <w:rPr/>
             </w:pPr>
             <w:r>
@@ -274,7 +266,6 @@
               <w:widowControl w:val="false"/>
               <w:suppressLineNumbers/>
               <w:bidi w:val="0"/>
-              <w:jc w:val="left"/>
               <w:rPr/>
             </w:pPr>
             <w:r>
@@ -301,7 +292,6 @@
               <w:widowControl w:val="false"/>
               <w:suppressLineNumbers/>
               <w:bidi w:val="0"/>
-              <w:jc w:val="left"/>
               <w:rPr/>
             </w:pPr>
             <w:r>
@@ -329,7 +319,6 @@
               <w:widowControl w:val="false"/>
               <w:suppressLineNumbers/>
               <w:bidi w:val="0"/>
-              <w:jc w:val="left"/>
               <w:rPr/>
             </w:pPr>
             <w:r>
@@ -356,7 +345,6 @@
               <w:widowControl w:val="false"/>
               <w:suppressLineNumbers/>
               <w:bidi w:val="0"/>
-              <w:jc w:val="left"/>
               <w:rPr/>
             </w:pPr>
             <w:r>
@@ -384,7 +372,6 @@
               <w:widowControl w:val="false"/>
               <w:suppressLineNumbers/>
               <w:bidi w:val="0"/>
-              <w:jc w:val="left"/>
               <w:rPr/>
             </w:pPr>
             <w:r>
@@ -411,7 +398,6 @@
               <w:widowControl w:val="false"/>
               <w:suppressLineNumbers/>
               <w:bidi w:val="0"/>
-              <w:jc w:val="left"/>
               <w:rPr/>
             </w:pPr>
             <w:r>
@@ -439,7 +425,6 @@
               <w:widowControl w:val="false"/>
               <w:suppressLineNumbers/>
               <w:bidi w:val="0"/>
-              <w:jc w:val="left"/>
               <w:rPr/>
             </w:pPr>
             <w:r>
@@ -466,7 +451,6 @@
               <w:widowControl w:val="false"/>
               <w:suppressLineNumbers/>
               <w:bidi w:val="0"/>
-              <w:jc w:val="left"/>
               <w:rPr/>
             </w:pPr>
             <w:r>
@@ -494,7 +478,6 @@
               <w:widowControl w:val="false"/>
               <w:suppressLineNumbers/>
               <w:bidi w:val="0"/>
-              <w:jc w:val="left"/>
               <w:rPr/>
             </w:pPr>
             <w:r>
@@ -521,7 +504,6 @@
               <w:widowControl w:val="false"/>
               <w:suppressLineNumbers/>
               <w:bidi w:val="0"/>
-              <w:jc w:val="left"/>
               <w:rPr/>
             </w:pPr>
             <w:r>
@@ -549,7 +531,6 @@
               <w:widowControl w:val="false"/>
               <w:suppressLineNumbers/>
               <w:bidi w:val="0"/>
-              <w:jc w:val="left"/>
               <w:rPr/>
             </w:pPr>
             <w:r>
@@ -576,7 +557,6 @@
               <w:widowControl w:val="false"/>
               <w:suppressLineNumbers/>
               <w:bidi w:val="0"/>
-              <w:jc w:val="left"/>
               <w:rPr/>
             </w:pPr>
             <w:r>
@@ -604,7 +584,6 @@
               <w:widowControl w:val="false"/>
               <w:suppressLineNumbers/>
               <w:bidi w:val="0"/>
-              <w:jc w:val="left"/>
               <w:rPr/>
             </w:pPr>
             <w:r>
@@ -631,7 +610,6 @@
               <w:widowControl w:val="false"/>
               <w:suppressLineNumbers/>
               <w:bidi w:val="0"/>
-              <w:jc w:val="left"/>
               <w:rPr/>
             </w:pPr>
             <w:r>
@@ -647,7 +625,6 @@
         <w:pStyle w:val="Heading2"/>
         <w:bidi w:val="0"/>
         <w:ind w:hanging="0" w:left="0" w:right="0"/>
-        <w:jc w:val="left"/>
         <w:rPr/>
       </w:pPr>
       <w:bookmarkStart w:id="4" w:name="sezione-2-competenze"/>
@@ -662,7 +639,6 @@
         <w:pStyle w:val="Heading3"/>
         <w:bidi w:val="0"/>
         <w:ind w:hanging="0" w:left="0" w:right="0"/>
-        <w:jc w:val="left"/>
         <w:rPr/>
       </w:pPr>
       <w:bookmarkStart w:id="5" w:name="competenze-chiave-europee-raccomandazion"/>
@@ -685,7 +661,6 @@
         </w:tabs>
         <w:bidi w:val="0"/>
         <w:ind w:hanging="283" w:left="709"/>
-        <w:jc w:val="left"/>
         <w:rPr/>
       </w:pPr>
       <w:r>
@@ -706,7 +681,6 @@
         </w:tabs>
         <w:bidi w:val="0"/>
         <w:ind w:hanging="283" w:left="709"/>
-        <w:jc w:val="left"/>
         <w:rPr/>
       </w:pPr>
       <w:r>
@@ -727,7 +701,6 @@
         </w:tabs>
         <w:bidi w:val="0"/>
         <w:ind w:hanging="283" w:left="709"/>
-        <w:jc w:val="left"/>
         <w:rPr/>
       </w:pPr>
       <w:r>
@@ -748,7 +721,6 @@
         </w:tabs>
         <w:bidi w:val="0"/>
         <w:ind w:hanging="283" w:left="709"/>
-        <w:jc w:val="left"/>
         <w:rPr/>
       </w:pPr>
       <w:r>
@@ -769,7 +741,6 @@
         </w:tabs>
         <w:bidi w:val="0"/>
         <w:ind w:hanging="283" w:left="709"/>
-        <w:jc w:val="left"/>
         <w:rPr/>
       </w:pPr>
       <w:r>
@@ -782,7 +753,6 @@
         <w:pStyle w:val="Heading3"/>
         <w:bidi w:val="0"/>
         <w:ind w:hanging="0" w:left="0" w:right="0"/>
-        <w:jc w:val="left"/>
         <w:rPr/>
       </w:pPr>
       <w:bookmarkStart w:id="6" w:name="traguardi-di-sviluppo-delle-competenze-i"/>
@@ -796,7 +766,6 @@
       <w:pPr>
         <w:pStyle w:val="BodyText"/>
         <w:bidi w:val="0"/>
-        <w:jc w:val="left"/>
         <w:rPr/>
       </w:pPr>
       <w:r>
@@ -819,7 +788,6 @@
         </w:tabs>
         <w:bidi w:val="0"/>
         <w:ind w:hanging="283" w:left="709"/>
-        <w:jc w:val="left"/>
         <w:rPr/>
       </w:pPr>
       <w:r>
@@ -840,7 +808,6 @@
         </w:tabs>
         <w:bidi w:val="0"/>
         <w:ind w:hanging="283" w:left="709"/>
-        <w:jc w:val="left"/>
         <w:rPr/>
       </w:pPr>
       <w:r>
@@ -861,7 +828,6 @@
         </w:tabs>
         <w:bidi w:val="0"/>
         <w:ind w:hanging="283" w:left="709"/>
-        <w:jc w:val="left"/>
         <w:rPr/>
       </w:pPr>
       <w:r>
@@ -882,7 +848,6 @@
         </w:tabs>
         <w:bidi w:val="0"/>
         <w:ind w:hanging="283" w:left="709"/>
-        <w:jc w:val="left"/>
         <w:rPr/>
       </w:pPr>
       <w:r>
@@ -894,7 +859,6 @@
       <w:pPr>
         <w:pStyle w:val="BodyText"/>
         <w:bidi w:val="0"/>
-        <w:jc w:val="left"/>
         <w:rPr/>
       </w:pPr>
       <w:r>
@@ -917,7 +881,6 @@
         </w:tabs>
         <w:bidi w:val="0"/>
         <w:ind w:hanging="283" w:left="709"/>
-        <w:jc w:val="left"/>
         <w:rPr/>
       </w:pPr>
       <w:r>
@@ -938,7 +901,6 @@
         </w:tabs>
         <w:bidi w:val="0"/>
         <w:ind w:hanging="283" w:left="709"/>
-        <w:jc w:val="left"/>
         <w:rPr/>
       </w:pPr>
       <w:r>
@@ -959,7 +921,6 @@
         </w:tabs>
         <w:bidi w:val="0"/>
         <w:ind w:hanging="283" w:left="709"/>
-        <w:jc w:val="left"/>
         <w:rPr/>
       </w:pPr>
       <w:r>
@@ -971,7 +932,6 @@
       <w:pPr>
         <w:pStyle w:val="BodyText"/>
         <w:bidi w:val="0"/>
-        <w:jc w:val="left"/>
         <w:rPr/>
       </w:pPr>
       <w:r>
@@ -994,7 +954,6 @@
         </w:tabs>
         <w:bidi w:val="0"/>
         <w:ind w:hanging="283" w:left="709"/>
-        <w:jc w:val="left"/>
         <w:rPr/>
       </w:pPr>
       <w:r>
@@ -1015,7 +974,6 @@
         </w:tabs>
         <w:bidi w:val="0"/>
         <w:ind w:hanging="283" w:left="709"/>
-        <w:jc w:val="left"/>
         <w:rPr/>
       </w:pPr>
       <w:r>
@@ -1036,7 +994,6 @@
         </w:tabs>
         <w:bidi w:val="0"/>
         <w:ind w:hanging="283" w:left="709"/>
-        <w:jc w:val="left"/>
         <w:rPr/>
       </w:pPr>
       <w:r>
@@ -1057,7 +1014,6 @@
         </w:tabs>
         <w:bidi w:val="0"/>
         <w:ind w:hanging="283" w:left="709"/>
-        <w:jc w:val="left"/>
         <w:rPr/>
       </w:pPr>
       <w:r>
@@ -1069,7 +1025,6 @@
       <w:pPr>
         <w:pStyle w:val="BodyText"/>
         <w:bidi w:val="0"/>
-        <w:jc w:val="left"/>
         <w:rPr/>
       </w:pPr>
       <w:r>
@@ -1092,7 +1047,6 @@
         </w:tabs>
         <w:bidi w:val="0"/>
         <w:ind w:hanging="283" w:left="709"/>
-        <w:jc w:val="left"/>
         <w:rPr/>
       </w:pPr>
       <w:r>
@@ -1113,7 +1067,6 @@
         </w:tabs>
         <w:bidi w:val="0"/>
         <w:ind w:hanging="283" w:left="709"/>
-        <w:jc w:val="left"/>
         <w:rPr/>
       </w:pPr>
       <w:r>
@@ -1134,7 +1087,6 @@
         </w:tabs>
         <w:bidi w:val="0"/>
         <w:ind w:hanging="283" w:left="709"/>
-        <w:jc w:val="left"/>
         <w:rPr/>
       </w:pPr>
       <w:r>
@@ -1146,7 +1098,6 @@
       <w:pPr>
         <w:pStyle w:val="BodyText"/>
         <w:bidi w:val="0"/>
-        <w:jc w:val="left"/>
         <w:rPr/>
       </w:pPr>
       <w:r>
@@ -1169,7 +1120,6 @@
         </w:tabs>
         <w:bidi w:val="0"/>
         <w:ind w:hanging="283" w:left="709"/>
-        <w:jc w:val="left"/>
         <w:rPr/>
       </w:pPr>
       <w:r>
@@ -1190,7 +1140,6 @@
         </w:tabs>
         <w:bidi w:val="0"/>
         <w:ind w:hanging="283" w:left="709"/>
-        <w:jc w:val="left"/>
         <w:rPr/>
       </w:pPr>
       <w:r>
@@ -1211,7 +1160,6 @@
         </w:tabs>
         <w:bidi w:val="0"/>
         <w:ind w:hanging="283" w:left="709"/>
-        <w:jc w:val="left"/>
         <w:rPr/>
       </w:pPr>
       <w:r>
@@ -1223,7 +1171,6 @@
       <w:pPr>
         <w:pStyle w:val="BodyText"/>
         <w:bidi w:val="0"/>
-        <w:jc w:val="left"/>
         <w:rPr/>
       </w:pPr>
       <w:r>
@@ -1246,7 +1193,6 @@
         </w:tabs>
         <w:bidi w:val="0"/>
         <w:ind w:hanging="283" w:left="709"/>
-        <w:jc w:val="left"/>
         <w:rPr/>
       </w:pPr>
       <w:r>
@@ -1267,7 +1213,6 @@
         </w:tabs>
         <w:bidi w:val="0"/>
         <w:ind w:hanging="283" w:left="709"/>
-        <w:jc w:val="left"/>
         <w:rPr/>
       </w:pPr>
       <w:r>
@@ -1279,7 +1224,6 @@
       <w:pPr>
         <w:pStyle w:val="BlockQuotation"/>
         <w:bidi w:val="0"/>
-        <w:jc w:val="left"/>
         <w:rPr/>
       </w:pPr>
       <w:r>
@@ -1298,7 +1242,6 @@
         <w:pStyle w:val="Heading2"/>
         <w:bidi w:val="0"/>
         <w:ind w:hanging="0" w:left="0" w:right="0"/>
-        <w:jc w:val="left"/>
         <w:rPr/>
       </w:pPr>
       <w:bookmarkStart w:id="7" w:name="sezione-3-obiettivi-di-apprendimento"/>
@@ -1312,7 +1255,6 @@
       <w:pPr>
         <w:pStyle w:val="BodyText"/>
         <w:bidi w:val="0"/>
-        <w:jc w:val="left"/>
         <w:rPr/>
       </w:pPr>
       <w:r>
@@ -1333,7 +1275,6 @@
         </w:tabs>
         <w:bidi w:val="0"/>
         <w:ind w:hanging="360" w:left="720"/>
-        <w:jc w:val="left"/>
         <w:rPr/>
       </w:pPr>
       <w:r>
@@ -1354,7 +1295,6 @@
         </w:tabs>
         <w:bidi w:val="0"/>
         <w:ind w:hanging="360" w:left="720"/>
-        <w:jc w:val="left"/>
         <w:rPr/>
       </w:pPr>
       <w:r>
@@ -1375,7 +1315,6 @@
         </w:tabs>
         <w:bidi w:val="0"/>
         <w:ind w:hanging="360" w:left="720"/>
-        <w:jc w:val="left"/>
         <w:rPr/>
       </w:pPr>
       <w:r>
@@ -1396,7 +1335,6 @@
         </w:tabs>
         <w:bidi w:val="0"/>
         <w:ind w:hanging="360" w:left="720"/>
-        <w:jc w:val="left"/>
         <w:rPr/>
       </w:pPr>
       <w:r>
@@ -1417,7 +1355,6 @@
         </w:tabs>
         <w:bidi w:val="0"/>
         <w:ind w:hanging="360" w:left="720"/>
-        <w:jc w:val="left"/>
         <w:rPr/>
       </w:pPr>
       <w:r>
@@ -1438,7 +1375,6 @@
         </w:tabs>
         <w:bidi w:val="0"/>
         <w:ind w:hanging="360" w:left="720"/>
-        <w:jc w:val="left"/>
         <w:rPr/>
       </w:pPr>
       <w:r>
@@ -1459,7 +1395,6 @@
         </w:tabs>
         <w:bidi w:val="0"/>
         <w:ind w:hanging="360" w:left="720"/>
-        <w:jc w:val="left"/>
         <w:rPr/>
       </w:pPr>
       <w:r>
@@ -1480,7 +1415,6 @@
         </w:tabs>
         <w:bidi w:val="0"/>
         <w:ind w:hanging="360" w:left="720"/>
-        <w:jc w:val="left"/>
         <w:rPr/>
       </w:pPr>
       <w:r>
@@ -1493,7 +1427,6 @@
         <w:pStyle w:val="Heading2"/>
         <w:bidi w:val="0"/>
         <w:ind w:hanging="0" w:left="0" w:right="0"/>
-        <w:jc w:val="left"/>
         <w:rPr/>
       </w:pPr>
       <w:bookmarkStart w:id="8" w:name="sezione-4-contenuti"/>
@@ -1593,7 +1526,6 @@
               <w:widowControl w:val="false"/>
               <w:suppressLineNumbers/>
               <w:bidi w:val="0"/>
-              <w:jc w:val="left"/>
               <w:rPr/>
             </w:pPr>
             <w:r>
@@ -1618,7 +1550,6 @@
               <w:widowControl w:val="false"/>
               <w:suppressLineNumbers/>
               <w:bidi w:val="0"/>
-              <w:jc w:val="left"/>
               <w:rPr/>
             </w:pPr>
             <w:r>
@@ -1646,7 +1577,6 @@
               <w:widowControl w:val="false"/>
               <w:suppressLineNumbers/>
               <w:bidi w:val="0"/>
-              <w:jc w:val="left"/>
               <w:rPr/>
             </w:pPr>
             <w:r>
@@ -1671,7 +1601,6 @@
               <w:widowControl w:val="false"/>
               <w:suppressLineNumbers/>
               <w:bidi w:val="0"/>
-              <w:jc w:val="left"/>
               <w:rPr/>
             </w:pPr>
             <w:r>
@@ -1699,7 +1628,6 @@
               <w:widowControl w:val="false"/>
               <w:suppressLineNumbers/>
               <w:bidi w:val="0"/>
-              <w:jc w:val="left"/>
               <w:rPr/>
             </w:pPr>
             <w:r>
@@ -1724,7 +1652,6 @@
               <w:widowControl w:val="false"/>
               <w:suppressLineNumbers/>
               <w:bidi w:val="0"/>
-              <w:jc w:val="left"/>
               <w:rPr/>
             </w:pPr>
             <w:r>
@@ -1752,7 +1679,6 @@
               <w:widowControl w:val="false"/>
               <w:suppressLineNumbers/>
               <w:bidi w:val="0"/>
-              <w:jc w:val="left"/>
               <w:rPr/>
             </w:pPr>
             <w:r>
@@ -1777,7 +1703,6 @@
               <w:widowControl w:val="false"/>
               <w:suppressLineNumbers/>
               <w:bidi w:val="0"/>
-              <w:jc w:val="left"/>
               <w:rPr/>
             </w:pPr>
             <w:r>
@@ -1805,7 +1730,6 @@
               <w:widowControl w:val="false"/>
               <w:suppressLineNumbers/>
               <w:bidi w:val="0"/>
-              <w:jc w:val="left"/>
               <w:rPr/>
             </w:pPr>
             <w:r>
@@ -1830,7 +1754,6 @@
               <w:widowControl w:val="false"/>
               <w:suppressLineNumbers/>
               <w:bidi w:val="0"/>
-              <w:jc w:val="left"/>
               <w:rPr/>
             </w:pPr>
             <w:r>
@@ -1858,7 +1781,6 @@
               <w:widowControl w:val="false"/>
               <w:suppressLineNumbers/>
               <w:bidi w:val="0"/>
-              <w:jc w:val="left"/>
               <w:rPr/>
             </w:pPr>
             <w:r>
@@ -1883,7 +1805,6 @@
               <w:widowControl w:val="false"/>
               <w:suppressLineNumbers/>
               <w:bidi w:val="0"/>
-              <w:jc w:val="left"/>
               <w:rPr/>
             </w:pPr>
             <w:r>
@@ -1899,7 +1820,6 @@
         <w:pStyle w:val="Heading2"/>
         <w:bidi w:val="0"/>
         <w:ind w:hanging="0" w:left="0" w:right="0"/>
-        <w:jc w:val="left"/>
         <w:rPr/>
       </w:pPr>
       <w:bookmarkStart w:id="9" w:name="sezione-5-articolazione-del-percorso"/>
@@ -1914,7 +1834,6 @@
         <w:pStyle w:val="Heading3"/>
         <w:bidi w:val="0"/>
         <w:ind w:hanging="0" w:left="0" w:right="0"/>
-        <w:jc w:val="left"/>
         <w:rPr/>
       </w:pPr>
       <w:bookmarkStart w:id="10" w:name="fase-1-presentazione-del-progetto-e-scel"/>
@@ -1928,7 +1847,6 @@
       <w:pPr>
         <w:pStyle w:val="BodyText"/>
         <w:bidi w:val="0"/>
-        <w:jc w:val="left"/>
         <w:rPr/>
       </w:pPr>
       <w:r>
@@ -1965,7 +1883,6 @@
         </w:tabs>
         <w:bidi w:val="0"/>
         <w:ind w:hanging="283" w:left="709"/>
-        <w:jc w:val="left"/>
         <w:rPr/>
       </w:pPr>
       <w:r>
@@ -1986,7 +1903,6 @@
         </w:tabs>
         <w:bidi w:val="0"/>
         <w:ind w:hanging="283" w:left="709"/>
-        <w:jc w:val="left"/>
         <w:rPr/>
       </w:pPr>
       <w:r>
@@ -2007,7 +1923,6 @@
         </w:tabs>
         <w:bidi w:val="0"/>
         <w:ind w:hanging="283" w:left="709"/>
-        <w:jc w:val="left"/>
         <w:rPr/>
       </w:pPr>
       <w:r>
@@ -2028,7 +1943,6 @@
         </w:tabs>
         <w:bidi w:val="0"/>
         <w:ind w:hanging="283" w:left="709"/>
-        <w:jc w:val="left"/>
         <w:rPr/>
       </w:pPr>
       <w:r>
@@ -2049,7 +1963,6 @@
         </w:tabs>
         <w:bidi w:val="0"/>
         <w:ind w:hanging="283" w:left="709"/>
-        <w:jc w:val="left"/>
         <w:rPr/>
       </w:pPr>
       <w:r>
@@ -2061,7 +1974,6 @@
       <w:pPr>
         <w:pStyle w:val="BodyText"/>
         <w:bidi w:val="0"/>
-        <w:jc w:val="left"/>
         <w:rPr/>
       </w:pPr>
       <w:r>
@@ -2080,7 +1992,6 @@
         <w:pStyle w:val="Heading3"/>
         <w:bidi w:val="0"/>
         <w:ind w:hanging="0" w:left="0" w:right="0"/>
-        <w:jc w:val="left"/>
         <w:rPr/>
       </w:pPr>
       <w:bookmarkStart w:id="11" w:name="fase-2-ricerca-delle-informazioni-e-usci"/>
@@ -2094,7 +2005,6 @@
       <w:pPr>
         <w:pStyle w:val="BodyText"/>
         <w:bidi w:val="0"/>
-        <w:jc w:val="left"/>
         <w:rPr/>
       </w:pPr>
       <w:r>
@@ -2131,7 +2041,6 @@
         </w:tabs>
         <w:bidi w:val="0"/>
         <w:ind w:hanging="283" w:left="709"/>
-        <w:jc w:val="left"/>
         <w:rPr/>
       </w:pPr>
       <w:r>
@@ -2152,7 +2061,6 @@
         </w:tabs>
         <w:bidi w:val="0"/>
         <w:ind w:hanging="283" w:left="709"/>
-        <w:jc w:val="left"/>
         <w:rPr/>
       </w:pPr>
       <w:r>
@@ -2173,7 +2081,6 @@
         </w:tabs>
         <w:bidi w:val="0"/>
         <w:ind w:hanging="283" w:left="709"/>
-        <w:jc w:val="left"/>
         <w:rPr/>
       </w:pPr>
       <w:r>
@@ -2194,7 +2101,6 @@
         </w:tabs>
         <w:bidi w:val="0"/>
         <w:ind w:hanging="283" w:left="709"/>
-        <w:jc w:val="left"/>
         <w:rPr/>
       </w:pPr>
       <w:r>
@@ -2215,7 +2121,6 @@
         </w:tabs>
         <w:bidi w:val="0"/>
         <w:ind w:hanging="283" w:left="709"/>
-        <w:jc w:val="left"/>
         <w:rPr/>
       </w:pPr>
       <w:r>
@@ -2227,7 +2132,6 @@
       <w:pPr>
         <w:pStyle w:val="BlockQuotation"/>
         <w:bidi w:val="0"/>
-        <w:jc w:val="left"/>
         <w:rPr/>
       </w:pPr>
       <w:r>
@@ -2245,7 +2149,6 @@
       <w:pPr>
         <w:pStyle w:val="BodyText"/>
         <w:bidi w:val="0"/>
-        <w:jc w:val="left"/>
         <w:rPr/>
       </w:pPr>
       <w:r>
@@ -2263,7 +2166,6 @@
       <w:pPr>
         <w:pStyle w:val="BodyText"/>
         <w:bidi w:val="0"/>
-        <w:jc w:val="left"/>
         <w:rPr/>
       </w:pPr>
       <w:r>
@@ -2282,7 +2184,6 @@
         <w:pStyle w:val="Heading3"/>
         <w:bidi w:val="0"/>
         <w:ind w:hanging="0" w:left="0" w:right="0"/>
-        <w:jc w:val="left"/>
         <w:rPr/>
       </w:pPr>
       <w:bookmarkStart w:id="12" w:name="fase-3-scrittura-del-testo-per-via"/>
@@ -2296,7 +2197,6 @@
       <w:pPr>
         <w:pStyle w:val="BodyText"/>
         <w:bidi w:val="0"/>
-        <w:jc w:val="left"/>
         <w:rPr/>
       </w:pPr>
       <w:r>
@@ -2333,7 +2233,6 @@
         </w:tabs>
         <w:bidi w:val="0"/>
         <w:ind w:hanging="283" w:left="709"/>
-        <w:jc w:val="left"/>
         <w:rPr/>
       </w:pPr>
       <w:r>
@@ -2354,7 +2253,6 @@
         </w:tabs>
         <w:bidi w:val="0"/>
         <w:ind w:hanging="283" w:left="709"/>
-        <w:jc w:val="left"/>
         <w:rPr/>
       </w:pPr>
       <w:r>
@@ -2375,7 +2273,6 @@
         </w:tabs>
         <w:bidi w:val="0"/>
         <w:ind w:hanging="283" w:left="709"/>
-        <w:jc w:val="left"/>
         <w:rPr/>
       </w:pPr>
       <w:r>
@@ -2396,7 +2293,6 @@
         </w:tabs>
         <w:bidi w:val="0"/>
         <w:ind w:hanging="283" w:left="709"/>
-        <w:jc w:val="left"/>
         <w:rPr/>
       </w:pPr>
       <w:r>
@@ -2408,7 +2304,6 @@
       <w:pPr>
         <w:pStyle w:val="BodyText"/>
         <w:bidi w:val="0"/>
-        <w:jc w:val="left"/>
         <w:rPr/>
       </w:pPr>
       <w:r>
@@ -2427,7 +2322,6 @@
         <w:pStyle w:val="Heading3"/>
         <w:bidi w:val="0"/>
         <w:ind w:hanging="0" w:left="0" w:right="0"/>
-        <w:jc w:val="left"/>
         <w:rPr/>
       </w:pPr>
       <w:bookmarkStart w:id="13" w:name="fase-4-diario-visivo-e-mappa"/>
@@ -2441,7 +2335,6 @@
       <w:pPr>
         <w:pStyle w:val="BodyText"/>
         <w:bidi w:val="0"/>
-        <w:jc w:val="left"/>
         <w:rPr/>
       </w:pPr>
       <w:r>
@@ -2478,7 +2371,6 @@
         </w:tabs>
         <w:bidi w:val="0"/>
         <w:ind w:hanging="283" w:left="709"/>
-        <w:jc w:val="left"/>
         <w:rPr/>
       </w:pPr>
       <w:r>
@@ -2499,7 +2391,6 @@
         </w:tabs>
         <w:bidi w:val="0"/>
         <w:ind w:hanging="283" w:left="709"/>
-        <w:jc w:val="left"/>
         <w:rPr/>
       </w:pPr>
       <w:r>
@@ -2520,7 +2411,6 @@
         </w:tabs>
         <w:bidi w:val="0"/>
         <w:ind w:hanging="283" w:left="709"/>
-        <w:jc w:val="left"/>
         <w:rPr/>
       </w:pPr>
       <w:r>
@@ -2572,7 +2462,6 @@
       <w:pPr>
         <w:pStyle w:val="BodyText"/>
         <w:bidi w:val="0"/>
-        <w:jc w:val="left"/>
         <w:rPr/>
       </w:pPr>
       <w:r>
@@ -2591,7 +2480,6 @@
         <w:pStyle w:val="Heading3"/>
         <w:bidi w:val="0"/>
         <w:ind w:hanging="0" w:left="0" w:right="0"/>
-        <w:jc w:val="left"/>
         <w:rPr/>
       </w:pPr>
       <w:bookmarkStart w:id="14" w:name="fase-5-costruzione-della-pagina-web"/>
@@ -2605,7 +2493,6 @@
       <w:pPr>
         <w:pStyle w:val="BodyText"/>
         <w:bidi w:val="0"/>
-        <w:jc w:val="left"/>
         <w:rPr/>
       </w:pPr>
       <w:r>
@@ -2642,7 +2529,6 @@
         </w:tabs>
         <w:bidi w:val="0"/>
         <w:ind w:hanging="283" w:left="709"/>
-        <w:jc w:val="left"/>
         <w:rPr/>
       </w:pPr>
       <w:r>
@@ -2663,7 +2549,6 @@
         </w:tabs>
         <w:bidi w:val="0"/>
         <w:ind w:hanging="283" w:left="709"/>
-        <w:jc w:val="left"/>
         <w:rPr/>
       </w:pPr>
       <w:r>
@@ -2684,7 +2569,6 @@
         </w:tabs>
         <w:bidi w:val="0"/>
         <w:ind w:hanging="283" w:left="1418"/>
-        <w:jc w:val="left"/>
         <w:rPr/>
       </w:pPr>
       <w:r>
@@ -2705,7 +2589,6 @@
         </w:tabs>
         <w:bidi w:val="0"/>
         <w:ind w:hanging="283" w:left="1418"/>
-        <w:jc w:val="left"/>
         <w:rPr/>
       </w:pPr>
       <w:r>
@@ -2726,7 +2609,6 @@
         </w:tabs>
         <w:bidi w:val="0"/>
         <w:ind w:hanging="283" w:left="1418"/>
-        <w:jc w:val="left"/>
         <w:rPr/>
       </w:pPr>
       <w:r>
@@ -2747,7 +2629,6 @@
         </w:tabs>
         <w:bidi w:val="0"/>
         <w:ind w:hanging="283" w:left="1418"/>
-        <w:jc w:val="left"/>
         <w:rPr/>
       </w:pPr>
       <w:r>
@@ -2768,7 +2649,6 @@
         </w:tabs>
         <w:bidi w:val="0"/>
         <w:ind w:hanging="283" w:left="1418"/>
-        <w:jc w:val="left"/>
         <w:rPr/>
       </w:pPr>
       <w:r>
@@ -2789,7 +2669,6 @@
         </w:tabs>
         <w:bidi w:val="0"/>
         <w:ind w:hanging="283" w:left="1418"/>
-        <w:jc w:val="left"/>
         <w:rPr/>
       </w:pPr>
       <w:r>
@@ -2810,7 +2689,6 @@
         </w:tabs>
         <w:bidi w:val="0"/>
         <w:ind w:hanging="283" w:left="1418"/>
-        <w:jc w:val="left"/>
         <w:rPr/>
       </w:pPr>
       <w:r>
@@ -2831,7 +2709,6 @@
         </w:tabs>
         <w:bidi w:val="0"/>
         <w:ind w:hanging="283" w:left="709"/>
-        <w:jc w:val="left"/>
         <w:rPr/>
       </w:pPr>
       <w:r>
@@ -2862,7 +2739,6 @@
         </w:tabs>
         <w:bidi w:val="0"/>
         <w:ind w:hanging="283" w:left="709"/>
-        <w:jc w:val="left"/>
         <w:rPr/>
       </w:pPr>
       <w:r>
@@ -2874,7 +2750,6 @@
       <w:pPr>
         <w:pStyle w:val="BodyText"/>
         <w:bidi w:val="0"/>
-        <w:jc w:val="left"/>
         <w:rPr/>
       </w:pPr>
       <w:r>
@@ -2893,7 +2768,6 @@
         <w:pStyle w:val="Heading3"/>
         <w:bidi w:val="0"/>
         <w:ind w:hanging="0" w:left="0" w:right="0"/>
-        <w:jc w:val="left"/>
         <w:rPr/>
       </w:pPr>
       <w:bookmarkStart w:id="15" w:name="fase-6-presentazione-alla-classe"/>
@@ -2907,7 +2781,6 @@
       <w:pPr>
         <w:pStyle w:val="BodyText"/>
         <w:bidi w:val="0"/>
-        <w:jc w:val="left"/>
         <w:rPr/>
       </w:pPr>
       <w:r>
@@ -2944,7 +2817,6 @@
         </w:tabs>
         <w:bidi w:val="0"/>
         <w:ind w:hanging="283" w:left="709"/>
-        <w:jc w:val="left"/>
         <w:rPr/>
       </w:pPr>
       <w:r>
@@ -2965,7 +2837,6 @@
         </w:tabs>
         <w:bidi w:val="0"/>
         <w:ind w:hanging="283" w:left="709"/>
-        <w:jc w:val="left"/>
         <w:rPr/>
       </w:pPr>
       <w:r>
@@ -2986,7 +2857,6 @@
         </w:tabs>
         <w:bidi w:val="0"/>
         <w:ind w:hanging="283" w:left="709"/>
-        <w:jc w:val="left"/>
         <w:rPr/>
       </w:pPr>
       <w:r>
@@ -3007,7 +2877,6 @@
         </w:tabs>
         <w:bidi w:val="0"/>
         <w:ind w:hanging="283" w:left="709"/>
-        <w:jc w:val="left"/>
         <w:rPr/>
       </w:pPr>
       <w:r>
@@ -3020,7 +2889,6 @@
         <w:pStyle w:val="Heading3"/>
         <w:bidi w:val="0"/>
         <w:ind w:hanging="0" w:left="0" w:right="0"/>
-        <w:jc w:val="left"/>
         <w:rPr/>
       </w:pPr>
       <w:bookmarkStart w:id="16" w:name="fase-7-restituzione-alla-comunità"/>
@@ -3034,7 +2902,6 @@
       <w:pPr>
         <w:pStyle w:val="BodyText"/>
         <w:bidi w:val="0"/>
-        <w:jc w:val="left"/>
         <w:rPr/>
       </w:pPr>
       <w:r>
@@ -3072,7 +2939,6 @@
         <w:bidi w:val="0"/>
         <w:spacing w:before="0" w:after="0"/>
         <w:ind w:hanging="283" w:left="709"/>
-        <w:jc w:val="left"/>
         <w:rPr/>
       </w:pPr>
       <w:r>
@@ -3104,7 +2970,6 @@
         <w:bidi w:val="0"/>
         <w:spacing w:before="0" w:after="0"/>
         <w:ind w:hanging="283" w:left="1418"/>
-        <w:jc w:val="left"/>
         <w:rPr/>
       </w:pPr>
       <w:r>
@@ -3132,7 +2997,6 @@
         <w:bidi w:val="0"/>
         <w:spacing w:before="0" w:after="0"/>
         <w:ind w:hanging="283" w:left="1418"/>
-        <w:jc w:val="left"/>
         <w:rPr/>
       </w:pPr>
       <w:r>
@@ -3160,7 +3024,6 @@
         <w:bidi w:val="0"/>
         <w:spacing w:before="0" w:after="0"/>
         <w:ind w:hanging="283" w:left="1418"/>
-        <w:jc w:val="left"/>
         <w:rPr/>
       </w:pPr>
       <w:r>
@@ -3187,7 +3050,6 @@
         </w:tabs>
         <w:bidi w:val="0"/>
         <w:ind w:hanging="283" w:left="709"/>
-        <w:jc w:val="left"/>
         <w:rPr/>
       </w:pPr>
       <w:r>
@@ -3199,7 +3061,6 @@
       <w:pPr>
         <w:pStyle w:val="BodyText"/>
         <w:bidi w:val="0"/>
-        <w:jc w:val="left"/>
         <w:rPr/>
       </w:pPr>
       <w:r>
@@ -3218,7 +3079,6 @@
         <w:pStyle w:val="Heading2"/>
         <w:bidi w:val="0"/>
         <w:ind w:hanging="0" w:left="0" w:right="0"/>
-        <w:jc w:val="left"/>
         <w:rPr/>
       </w:pPr>
       <w:bookmarkStart w:id="17" w:name="sezione-6-metodologie-e-strumenti"/>
@@ -3232,7 +3092,6 @@
       <w:pPr>
         <w:pStyle w:val="BodyText"/>
         <w:bidi w:val="0"/>
-        <w:jc w:val="left"/>
         <w:rPr/>
       </w:pPr>
       <w:r>
@@ -3250,7 +3109,6 @@
       <w:pPr>
         <w:pStyle w:val="BodyText"/>
         <w:bidi w:val="0"/>
-        <w:jc w:val="left"/>
         <w:rPr/>
       </w:pPr>
       <w:r>
@@ -3273,7 +3131,6 @@
         </w:tabs>
         <w:bidi w:val="0"/>
         <w:ind w:hanging="283" w:left="709"/>
-        <w:jc w:val="left"/>
         <w:rPr/>
       </w:pPr>
       <w:r>
@@ -3294,7 +3151,6 @@
         </w:tabs>
         <w:bidi w:val="0"/>
         <w:ind w:hanging="283" w:left="709"/>
-        <w:jc w:val="left"/>
         <w:rPr/>
       </w:pPr>
       <w:r>
@@ -3315,7 +3171,6 @@
         </w:tabs>
         <w:bidi w:val="0"/>
         <w:ind w:hanging="283" w:left="709"/>
-        <w:jc w:val="left"/>
         <w:rPr/>
       </w:pPr>
       <w:r>
@@ -3336,7 +3191,6 @@
         </w:tabs>
         <w:bidi w:val="0"/>
         <w:ind w:hanging="283" w:left="709"/>
-        <w:jc w:val="left"/>
         <w:rPr/>
       </w:pPr>
       <w:r>
@@ -3357,7 +3211,6 @@
         </w:tabs>
         <w:bidi w:val="0"/>
         <w:ind w:hanging="283" w:left="709"/>
-        <w:jc w:val="left"/>
         <w:rPr/>
       </w:pPr>
       <w:r>
@@ -3370,7 +3223,6 @@
         <w:pStyle w:val="Heading2"/>
         <w:bidi w:val="0"/>
         <w:ind w:hanging="0" w:left="0" w:right="0"/>
-        <w:jc w:val="left"/>
         <w:rPr/>
       </w:pPr>
       <w:bookmarkStart w:id="18" w:name="sezione-6-bis-personalizzazione-e-inclus"/>
@@ -3384,7 +3236,6 @@
       <w:pPr>
         <w:pStyle w:val="BlockQuotation"/>
         <w:bidi w:val="0"/>
-        <w:jc w:val="left"/>
         <w:rPr/>
       </w:pPr>
       <w:r>
@@ -3396,7 +3247,6 @@
       <w:pPr>
         <w:pStyle w:val="BodyText"/>
         <w:bidi w:val="0"/>
-        <w:jc w:val="left"/>
         <w:rPr/>
       </w:pPr>
       <w:r>
@@ -3418,7 +3268,6 @@
         <w:bidi w:val="0"/>
         <w:spacing w:before="0" w:after="0"/>
         <w:ind w:hanging="283" w:left="709"/>
-        <w:jc w:val="left"/>
         <w:rPr/>
       </w:pPr>
       <w:r>
@@ -3429,7 +3278,17 @@
       </w:r>
       <w:r>
         <w:rPr/>
-        <w:t xml:space="preserve"> (equivalenti a tutti gli effetti, da indicare nel PEI/PDP come modalità di verifica personalizzata): </w:t>
+        <w:t xml:space="preserve">, equivalenti a tutti gli effetti e </w:t>
+      </w:r>
+      <w:r>
+        <w:rPr>
+          <w:rStyle w:val="Strong"/>
+        </w:rPr>
+        <w:t>aperti a tutta la classe</w:t>
+      </w:r>
+      <w:r>
+        <w:rPr/>
+        <w:t xml:space="preserve">: chiunque può sceglierli, e per gli alunni con PEI o PDP si indicano nel piano come modalità di verifica personalizzata: </w:t>
       </w:r>
     </w:p>
     <w:p>
@@ -3446,7 +3305,6 @@
         <w:bidi w:val="0"/>
         <w:spacing w:before="0" w:after="0"/>
         <w:ind w:hanging="283" w:left="1418"/>
-        <w:jc w:val="left"/>
         <w:rPr/>
       </w:pPr>
       <w:r>
@@ -3457,7 +3315,7 @@
       </w:r>
       <w:r>
         <w:rPr/>
-        <w:t xml:space="preserve">: il testo registrato con la propria voce (anche a partire da una scaletta), pubblicato come traccia nella pagina; </w:t>
+        <w:t xml:space="preserve">: il testo registrato con la propria voce (anche a partire da una scaletta), pubblicato come traccia nella pagina; è facoltativo e richiede il consenso dei genitori alla voce (Modulo B del kit privacy); </w:t>
       </w:r>
     </w:p>
     <w:p>
@@ -3474,7 +3332,6 @@
         <w:bidi w:val="0"/>
         <w:spacing w:before="0" w:after="0"/>
         <w:ind w:hanging="283" w:left="1418"/>
-        <w:jc w:val="left"/>
         <w:rPr/>
       </w:pPr>
       <w:r>
@@ -3502,7 +3359,6 @@
         <w:bidi w:val="0"/>
         <w:spacing w:before="0" w:after="0"/>
         <w:ind w:hanging="283" w:left="1418"/>
-        <w:jc w:val="left"/>
         <w:rPr/>
       </w:pPr>
       <w:r>
@@ -3530,7 +3386,6 @@
         <w:bidi w:val="0"/>
         <w:spacing w:before="0" w:after="0"/>
         <w:ind w:hanging="283" w:left="1418"/>
-        <w:jc w:val="left"/>
         <w:rPr/>
       </w:pPr>
       <w:r>
@@ -3558,7 +3413,33 @@
         <w:bidi w:val="0"/>
         <w:spacing w:before="0" w:after="0"/>
         <w:ind w:hanging="283" w:left="709"/>
-        <w:jc w:val="left"/>
+        <w:rPr/>
+      </w:pPr>
+      <w:r>
+        <w:rPr>
+          <w:rStyle w:val="Strong"/>
+        </w:rPr>
+        <w:t>Riservatezza</w:t>
+      </w:r>
+      <w:r>
+        <w:rPr/>
+        <w:t xml:space="preserve">: la pagina pubblicata non deve mai far capire quali alunni hanno un PEI o un PDP. Nessun formato, ruolo, didascalia o nota si collega a misure personalizzate: sono informazioni riservate, protette in modo particolare dalla normativa sulla privacy. La redazione lo controlla prima di pubblicare. </w:t>
+      </w:r>
+    </w:p>
+    <w:p>
+      <w:pPr>
+        <w:pStyle w:val="BodyText"/>
+        <w:numPr>
+          <w:ilvl w:val="0"/>
+          <w:numId w:val="17"/>
+        </w:numPr>
+        <w:tabs>
+          <w:tab w:val="clear" w:pos="709"/>
+          <w:tab w:val="left" w:pos="709" w:leader="none"/>
+        </w:tabs>
+        <w:bidi w:val="0"/>
+        <w:spacing w:before="0" w:after="0"/>
+        <w:ind w:hanging="283" w:left="709"/>
         <w:rPr/>
       </w:pPr>
       <w:r>
@@ -3586,7 +3467,6 @@
         <w:bidi w:val="0"/>
         <w:spacing w:before="0" w:after="0"/>
         <w:ind w:hanging="283" w:left="709"/>
-        <w:jc w:val="left"/>
         <w:rPr/>
       </w:pPr>
       <w:r>
@@ -3623,7 +3503,6 @@
         </w:tabs>
         <w:bidi w:val="0"/>
         <w:ind w:hanging="283" w:left="709"/>
-        <w:jc w:val="left"/>
         <w:rPr/>
       </w:pPr>
       <w:r>
@@ -3641,7 +3520,6 @@
       <w:pPr>
         <w:pStyle w:val="BodyText"/>
         <w:bidi w:val="0"/>
-        <w:jc w:val="left"/>
         <w:rPr/>
       </w:pPr>
       <w:r>
@@ -3660,7 +3538,6 @@
         <w:pStyle w:val="Heading2"/>
         <w:bidi w:val="0"/>
         <w:ind w:hanging="0" w:left="0" w:right="0"/>
-        <w:jc w:val="left"/>
         <w:rPr/>
       </w:pPr>
       <w:bookmarkStart w:id="19" w:name="sezione-7-valutazione"/>
@@ -3675,7 +3552,6 @@
         <w:pStyle w:val="Heading3"/>
         <w:bidi w:val="0"/>
         <w:ind w:hanging="0" w:left="0" w:right="0"/>
-        <w:jc w:val="left"/>
         <w:rPr/>
       </w:pPr>
       <w:bookmarkStart w:id="20" w:name="cosa-si-valuta"/>
@@ -3801,7 +3677,6 @@
               <w:widowControl w:val="false"/>
               <w:suppressLineNumbers/>
               <w:bidi w:val="0"/>
-              <w:jc w:val="left"/>
               <w:rPr/>
             </w:pPr>
             <w:r>
@@ -3826,7 +3701,6 @@
               <w:widowControl w:val="false"/>
               <w:suppressLineNumbers/>
               <w:bidi w:val="0"/>
-              <w:jc w:val="left"/>
               <w:rPr/>
             </w:pPr>
             <w:r>
@@ -3851,7 +3725,6 @@
               <w:widowControl w:val="false"/>
               <w:suppressLineNumbers/>
               <w:bidi w:val="0"/>
-              <w:jc w:val="left"/>
               <w:rPr/>
             </w:pPr>
             <w:r>
@@ -3879,7 +3752,6 @@
               <w:widowControl w:val="false"/>
               <w:suppressLineNumbers/>
               <w:bidi w:val="0"/>
-              <w:jc w:val="left"/>
               <w:rPr/>
             </w:pPr>
             <w:r>
@@ -3904,7 +3776,6 @@
               <w:widowControl w:val="false"/>
               <w:suppressLineNumbers/>
               <w:bidi w:val="0"/>
-              <w:jc w:val="left"/>
               <w:rPr/>
             </w:pPr>
             <w:r>
@@ -3929,7 +3800,6 @@
               <w:widowControl w:val="false"/>
               <w:suppressLineNumbers/>
               <w:bidi w:val="0"/>
-              <w:jc w:val="left"/>
               <w:rPr/>
             </w:pPr>
             <w:r>
@@ -3957,7 +3827,6 @@
               <w:widowControl w:val="false"/>
               <w:suppressLineNumbers/>
               <w:bidi w:val="0"/>
-              <w:jc w:val="left"/>
               <w:rPr/>
             </w:pPr>
             <w:r>
@@ -3982,7 +3851,6 @@
               <w:widowControl w:val="false"/>
               <w:suppressLineNumbers/>
               <w:bidi w:val="0"/>
-              <w:jc w:val="left"/>
               <w:rPr/>
             </w:pPr>
             <w:r>
@@ -4007,7 +3875,6 @@
               <w:widowControl w:val="false"/>
               <w:suppressLineNumbers/>
               <w:bidi w:val="0"/>
-              <w:jc w:val="left"/>
               <w:rPr/>
             </w:pPr>
             <w:r>
@@ -4035,7 +3902,6 @@
               <w:widowControl w:val="false"/>
               <w:suppressLineNumbers/>
               <w:bidi w:val="0"/>
-              <w:jc w:val="left"/>
               <w:rPr/>
             </w:pPr>
             <w:r>
@@ -4060,7 +3926,6 @@
               <w:widowControl w:val="false"/>
               <w:suppressLineNumbers/>
               <w:bidi w:val="0"/>
-              <w:jc w:val="left"/>
               <w:rPr/>
             </w:pPr>
             <w:r>
@@ -4085,7 +3950,6 @@
               <w:widowControl w:val="false"/>
               <w:suppressLineNumbers/>
               <w:bidi w:val="0"/>
-              <w:jc w:val="left"/>
               <w:rPr/>
             </w:pPr>
             <w:r>
@@ -4113,7 +3977,6 @@
               <w:widowControl w:val="false"/>
               <w:suppressLineNumbers/>
               <w:bidi w:val="0"/>
-              <w:jc w:val="left"/>
               <w:rPr/>
             </w:pPr>
             <w:r>
@@ -4138,7 +4001,6 @@
               <w:widowControl w:val="false"/>
               <w:suppressLineNumbers/>
               <w:bidi w:val="0"/>
-              <w:jc w:val="left"/>
               <w:rPr/>
             </w:pPr>
             <w:r>
@@ -4163,7 +4025,6 @@
               <w:widowControl w:val="false"/>
               <w:suppressLineNumbers/>
               <w:bidi w:val="0"/>
-              <w:jc w:val="left"/>
               <w:rPr/>
             </w:pPr>
             <w:r>
@@ -4178,7 +4039,6 @@
       <w:pPr>
         <w:pStyle w:val="BodyText"/>
         <w:bidi w:val="0"/>
-        <w:jc w:val="left"/>
         <w:rPr/>
       </w:pPr>
       <w:r>
@@ -4190,7 +4050,6 @@
       <w:pPr>
         <w:pStyle w:val="BodyText"/>
         <w:bidi w:val="0"/>
-        <w:jc w:val="left"/>
         <w:rPr/>
       </w:pPr>
       <w:r>
@@ -4203,7 +4062,6 @@
         <w:pStyle w:val="Heading3"/>
         <w:bidi w:val="0"/>
         <w:ind w:hanging="0" w:left="0" w:right="0"/>
-        <w:jc w:val="left"/>
         <w:rPr/>
       </w:pPr>
       <w:bookmarkStart w:id="21" w:name="rubrica-sintetica-testo-per-via"/>
@@ -4381,7 +4239,6 @@
               <w:widowControl w:val="false"/>
               <w:suppressLineNumbers/>
               <w:bidi w:val="0"/>
-              <w:jc w:val="left"/>
               <w:rPr/>
             </w:pPr>
             <w:r>
@@ -4406,7 +4263,6 @@
               <w:widowControl w:val="false"/>
               <w:suppressLineNumbers/>
               <w:bidi w:val="0"/>
-              <w:jc w:val="left"/>
               <w:rPr/>
             </w:pPr>
             <w:r>
@@ -4431,7 +4287,6 @@
               <w:widowControl w:val="false"/>
               <w:suppressLineNumbers/>
               <w:bidi w:val="0"/>
-              <w:jc w:val="left"/>
               <w:rPr/>
             </w:pPr>
             <w:r>
@@ -4456,7 +4311,6 @@
               <w:widowControl w:val="false"/>
               <w:suppressLineNumbers/>
               <w:bidi w:val="0"/>
-              <w:jc w:val="left"/>
               <w:rPr/>
             </w:pPr>
             <w:r>
@@ -4481,7 +4335,6 @@
               <w:widowControl w:val="false"/>
               <w:suppressLineNumbers/>
               <w:bidi w:val="0"/>
-              <w:jc w:val="left"/>
               <w:rPr/>
             </w:pPr>
             <w:r>
@@ -4509,7 +4362,6 @@
               <w:widowControl w:val="false"/>
               <w:suppressLineNumbers/>
               <w:bidi w:val="0"/>
-              <w:jc w:val="left"/>
               <w:rPr/>
             </w:pPr>
             <w:r>
@@ -4534,7 +4386,6 @@
               <w:widowControl w:val="false"/>
               <w:suppressLineNumbers/>
               <w:bidi w:val="0"/>
-              <w:jc w:val="left"/>
               <w:rPr/>
             </w:pPr>
             <w:r>
@@ -4559,7 +4410,6 @@
               <w:widowControl w:val="false"/>
               <w:suppressLineNumbers/>
               <w:bidi w:val="0"/>
-              <w:jc w:val="left"/>
               <w:rPr/>
             </w:pPr>
             <w:r>
@@ -4584,7 +4434,6 @@
               <w:widowControl w:val="false"/>
               <w:suppressLineNumbers/>
               <w:bidi w:val="0"/>
-              <w:jc w:val="left"/>
               <w:rPr/>
             </w:pPr>
             <w:r>
@@ -4609,7 +4458,6 @@
               <w:widowControl w:val="false"/>
               <w:suppressLineNumbers/>
               <w:bidi w:val="0"/>
-              <w:jc w:val="left"/>
               <w:rPr/>
             </w:pPr>
             <w:r>
@@ -4637,7 +4485,6 @@
               <w:widowControl w:val="false"/>
               <w:suppressLineNumbers/>
               <w:bidi w:val="0"/>
-              <w:jc w:val="left"/>
               <w:rPr/>
             </w:pPr>
             <w:r>
@@ -4662,7 +4509,6 @@
               <w:widowControl w:val="false"/>
               <w:suppressLineNumbers/>
               <w:bidi w:val="0"/>
-              <w:jc w:val="left"/>
               <w:rPr/>
             </w:pPr>
             <w:r>
@@ -4687,7 +4533,6 @@
               <w:widowControl w:val="false"/>
               <w:suppressLineNumbers/>
               <w:bidi w:val="0"/>
-              <w:jc w:val="left"/>
               <w:rPr/>
             </w:pPr>
             <w:r>
@@ -4712,7 +4557,6 @@
               <w:widowControl w:val="false"/>
               <w:suppressLineNumbers/>
               <w:bidi w:val="0"/>
-              <w:jc w:val="left"/>
               <w:rPr/>
             </w:pPr>
             <w:r>
@@ -4737,7 +4581,6 @@
               <w:widowControl w:val="false"/>
               <w:suppressLineNumbers/>
               <w:bidi w:val="0"/>
-              <w:jc w:val="left"/>
               <w:rPr/>
             </w:pPr>
             <w:r>
@@ -4765,7 +4608,6 @@
               <w:widowControl w:val="false"/>
               <w:suppressLineNumbers/>
               <w:bidi w:val="0"/>
-              <w:jc w:val="left"/>
               <w:rPr/>
             </w:pPr>
             <w:r>
@@ -4790,7 +4632,6 @@
               <w:widowControl w:val="false"/>
               <w:suppressLineNumbers/>
               <w:bidi w:val="0"/>
-              <w:jc w:val="left"/>
               <w:rPr/>
             </w:pPr>
             <w:r>
@@ -4815,7 +4656,6 @@
               <w:widowControl w:val="false"/>
               <w:suppressLineNumbers/>
               <w:bidi w:val="0"/>
-              <w:jc w:val="left"/>
               <w:rPr/>
             </w:pPr>
             <w:r>
@@ -4840,7 +4680,6 @@
               <w:widowControl w:val="false"/>
               <w:suppressLineNumbers/>
               <w:bidi w:val="0"/>
-              <w:jc w:val="left"/>
               <w:rPr/>
             </w:pPr>
             <w:r>
@@ -4865,7 +4704,6 @@
               <w:widowControl w:val="false"/>
               <w:suppressLineNumbers/>
               <w:bidi w:val="0"/>
-              <w:jc w:val="left"/>
               <w:rPr/>
             </w:pPr>
             <w:r>
@@ -4881,7 +4719,6 @@
         <w:pStyle w:val="Heading3"/>
         <w:bidi w:val="0"/>
         <w:ind w:hanging="0" w:left="0" w:right="0"/>
-        <w:jc w:val="left"/>
         <w:rPr/>
       </w:pPr>
       <w:bookmarkStart w:id="22" w:name="rubrica-diario-visivo"/>
@@ -5059,7 +4896,6 @@
               <w:widowControl w:val="false"/>
               <w:suppressLineNumbers/>
               <w:bidi w:val="0"/>
-              <w:jc w:val="left"/>
               <w:rPr/>
             </w:pPr>
             <w:r>
@@ -5084,7 +4920,6 @@
               <w:widowControl w:val="false"/>
               <w:suppressLineNumbers/>
               <w:bidi w:val="0"/>
-              <w:jc w:val="left"/>
               <w:rPr/>
             </w:pPr>
             <w:r>
@@ -5109,7 +4944,6 @@
               <w:widowControl w:val="false"/>
               <w:suppressLineNumbers/>
               <w:bidi w:val="0"/>
-              <w:jc w:val="left"/>
               <w:rPr/>
             </w:pPr>
             <w:r>
@@ -5134,7 +4968,6 @@
               <w:widowControl w:val="false"/>
               <w:suppressLineNumbers/>
               <w:bidi w:val="0"/>
-              <w:jc w:val="left"/>
               <w:rPr/>
             </w:pPr>
             <w:r>
@@ -5159,7 +4992,6 @@
               <w:widowControl w:val="false"/>
               <w:suppressLineNumbers/>
               <w:bidi w:val="0"/>
-              <w:jc w:val="left"/>
               <w:rPr/>
             </w:pPr>
             <w:r>
@@ -5175,7 +5007,6 @@
         <w:pStyle w:val="Heading3"/>
         <w:bidi w:val="0"/>
         <w:ind w:hanging="0" w:left="0" w:right="0"/>
-        <w:jc w:val="left"/>
         <w:rPr/>
       </w:pPr>
       <w:bookmarkStart w:id="23" w:name="autovalutazione-alunno-scheda-da-consegn"/>
@@ -5198,7 +5029,6 @@
         </w:tabs>
         <w:bidi w:val="0"/>
         <w:ind w:hanging="360" w:left="720"/>
-        <w:jc w:val="left"/>
         <w:rPr/>
       </w:pPr>
       <w:r>
@@ -5219,7 +5049,6 @@
         </w:tabs>
         <w:bidi w:val="0"/>
         <w:ind w:hanging="360" w:left="720"/>
-        <w:jc w:val="left"/>
         <w:rPr/>
       </w:pPr>
       <w:r>
@@ -5240,7 +5069,6 @@
         </w:tabs>
         <w:bidi w:val="0"/>
         <w:ind w:hanging="360" w:left="720"/>
-        <w:jc w:val="left"/>
         <w:rPr/>
       </w:pPr>
       <w:r>
@@ -5261,7 +5089,6 @@
         </w:tabs>
         <w:bidi w:val="0"/>
         <w:ind w:hanging="360" w:left="720"/>
-        <w:jc w:val="left"/>
         <w:rPr/>
       </w:pPr>
       <w:r>
@@ -5274,7 +5101,6 @@
         <w:pStyle w:val="Heading2"/>
         <w:bidi w:val="0"/>
         <w:ind w:hanging="0" w:left="0" w:right="0"/>
-        <w:jc w:val="left"/>
         <w:rPr/>
       </w:pPr>
       <w:bookmarkStart w:id="24" w:name="allegati-consigliati"/>
@@ -5297,7 +5123,6 @@
         </w:tabs>
         <w:bidi w:val="0"/>
         <w:ind w:hanging="283" w:left="709"/>
-        <w:jc w:val="left"/>
         <w:rPr/>
       </w:pPr>
       <w:r>
@@ -5318,7 +5143,6 @@
         </w:tabs>
         <w:bidi w:val="0"/>
         <w:ind w:hanging="283" w:left="709"/>
-        <w:jc w:val="left"/>
         <w:rPr/>
       </w:pPr>
       <w:r>
@@ -5339,7 +5163,6 @@
         </w:tabs>
         <w:bidi w:val="0"/>
         <w:ind w:hanging="283" w:left="709"/>
-        <w:jc w:val="left"/>
         <w:rPr/>
       </w:pPr>
       <w:r>
@@ -5360,7 +5183,6 @@
         </w:tabs>
         <w:bidi w:val="0"/>
         <w:ind w:hanging="283" w:left="709"/>
-        <w:jc w:val="left"/>
         <w:rPr/>
       </w:pPr>
       <w:r>
@@ -5373,7 +5195,6 @@
         <w:pStyle w:val="BodyText"/>
         <w:bidi w:val="0"/>
         <w:spacing w:before="0" w:after="140"/>
-        <w:jc w:val="left"/>
         <w:rPr/>
       </w:pPr>
       <w:r>
@@ -8136,7 +7957,7 @@
   <w:docDefaults>
     <w:rPrDefault>
       <w:rPr>
-        <w:rFonts w:ascii="Liberation Serif" w:hAnsi="Liberation Serif" w:eastAsia="Songti SC" w:cs="Arial Unicode MS"/>
+        <w:rFonts w:ascii="Liberation Serif" w:hAnsi="Liberation Serif" w:eastAsia="Linux Libertine G" w:cs="Noto Sans"/>
         <w:sz w:val="24"/>
         <w:szCs w:val="24"/>
         <w:lang w:val="it-IT" w:eastAsia="zh-CN" w:bidi="hi-IN"/>
@@ -8156,7 +7977,7 @@
       <w:bidi w:val="0"/>
     </w:pPr>
     <w:rPr>
-      <w:rFonts w:ascii="Liberation Serif" w:hAnsi="Liberation Serif" w:eastAsia="Songti SC" w:cs="Arial Unicode MS"/>
+      <w:rFonts w:ascii="Liberation Serif" w:hAnsi="Liberation Serif" w:eastAsia="Linux Libertine G" w:cs="Noto Sans"/>
       <w:color w:val="auto"/>
       <w:sz w:val="24"/>
       <w:szCs w:val="24"/>
@@ -8259,7 +8080,7 @@
       <w:spacing w:before="240" w:after="120"/>
     </w:pPr>
     <w:rPr>
-      <w:rFonts w:ascii="Liberation Sans" w:hAnsi="Liberation Sans" w:eastAsia="Arial Unicode MS" w:cs="Arial Unicode MS"/>
+      <w:rFonts w:ascii="Liberation Sans" w:hAnsi="Liberation Sans" w:eastAsia="Linux Libertine G" w:cs="Noto Sans"/>
       <w:sz w:val="28"/>
       <w:szCs w:val="28"/>
     </w:rPr>
@@ -8277,7 +8098,7 @@
     <w:basedOn w:val="BodyText"/>
     <w:pPr/>
     <w:rPr>
-      <w:rFonts w:cs="Arial Unicode MS"/>
+      <w:rFonts w:cs="Noto Sans"/>
     </w:rPr>
   </w:style>
   <w:style w:type="paragraph" w:styleId="Caption">
@@ -8289,7 +8110,7 @@
       <w:spacing w:before="120" w:after="120"/>
     </w:pPr>
     <w:rPr>
-      <w:rFonts w:cs="Arial Unicode MS"/>
+      <w:rFonts w:cs="Noto Sans"/>
       <w:i/>
       <w:iCs/>
       <w:sz w:val="24"/>
@@ -8304,7 +8125,7 @@
       <w:suppressLineNumbers/>
     </w:pPr>
     <w:rPr>
-      <w:rFonts w:cs="Arial Unicode MS"/>
+      <w:rFonts w:cs="Noto Sans"/>
     </w:rPr>
   </w:style>
   <w:style w:type="paragraph" w:styleId="BlockQuotation">

</xml_diff>